<commit_message>
Repair inline picture scaffolds for Word
</commit_message>
<xml_diff>
--- a/tests/fixtures/word-regenerate-invalid/regenerated/broken/header-with-rid-no-sidecar.docx
+++ b/tests/fixtures/word-regenerate-invalid/regenerated/broken/header-with-rid-no-sidecar.docx
@@ -27,12 +27,30 @@
     <w:r>
       <w:drawing>
         <wp:inline xmlns:wp="http://schemas.openxmlformats.org/drawingml/2006/wordprocessingDrawing">
+          <wp:extent cx="95250" cy="95250"/>
+          <wp:docPr id="1" name="Picture 1"/>
           <a:graphic xmlns:a="http://schemas.openxmlformats.org/drawingml/2006/main">
             <a:graphicData uri="http://schemas.openxmlformats.org/drawingml/2006/picture">
               <pic:pic xmlns:pic="http://schemas.openxmlformats.org/drawingml/2006/picture">
+                <pic:nvPicPr>
+                  <pic:cNvPr id="0" name="image1.png"/>
+                  <pic:cNvPicPr/>
+                </pic:nvPicPr>
                 <pic:blipFill>
                   <a:blip r:embed="rId1"/>
+                  <a:stretch>
+                    <a:fillRect/>
+                  </a:stretch>
                 </pic:blipFill>
+                <pic:spPr>
+                  <a:xfrm>
+                    <a:off x="0" y="0"/>
+                    <a:ext cx="95250" cy="95250"/>
+                  </a:xfrm>
+                  <a:prstGeom prst="rect">
+                    <a:avLst/>
+                  </a:prstGeom>
+                </pic:spPr>
               </pic:pic>
             </a:graphicData>
           </a:graphic>

</xml_diff>